<commit_message>
Add rate limiting to /api/analyze, close out the documented gap
Adds an in-process sliding-window rate limiter (enforce_rate_limit in
web/api.py) scoped to /api/analyze, keyed on Cloudflare's
CF-Connecting-IP header. 30 req/60s default, env-configurable. 6 unit
tests in tests/web/test_api_rate_limit.py.

Updates SOLUTION_WALKTHROUGH.md and the submitted .docx (S10 narrative,
S13 limitations, and the implemented/not-yet-implemented table) to
reflect the change honestly, including the new limitation this
introduces: single-process state, no shared store across container
instances. Precision and SHAP completeness remain deliberately
undefended by design, not left out of the fix by oversight.
</commit_message>
<xml_diff>
--- a/Chakravyuh_Solution_Walkthrough.docx
+++ b/Chakravyuh_Solution_Walkthrough.docx
@@ -6881,8 +6881,28 @@
                 <w:color w:val="000000"/>
                 <w:sz w:val="14"/>
               </w:rPr>
-              <w:t>Rate limiting / response quantisation on the public API — §10 below</w:t>
+              <w:t>Shared/distributed rate-limit store across multiple container instances (current limiter is single-process in-memory) — §10</w:t>
             </w:r>
+          </w:p>
+        </w:tc>
+      </w:tr>
+      <w:tr>
+        <w:tc>
+          <w:tcPr>
+            <w:tcW w:type="dxa" w:w="4252"/>
+          </w:tcPr>
+          <w:p>
+            <w:r>
+              <w:t>Rate limiting on /api/analyze (in-process sliding window; tests/web/test_api_rate_limit.py) — §10</w:t>
+            </w:r>
+          </w:p>
+        </w:tc>
+        <w:tc>
+          <w:tcPr>
+            <w:tcW w:type="dxa" w:w="4252"/>
+          </w:tcPr>
+          <w:p>
+            <w:r/>
           </w:p>
         </w:tc>
       </w:tr>
@@ -6918,7 +6938,7 @@
         <w:t xml:space="preserve">Red-teamed our own live API. </w:t>
       </w:r>
       <w:r>
-        <w:t>Probing /api/analyze surfaced a real model-extraction exposure — no rate limiting, full-precision probabilities, complete SHAP on every call — enough to binary-search the decision boundary via query access alone. A live CORS misconfiguration (allow_origins="*" with allow_credentials=True) found in the same pass was fixed on the spot. The extraction surface itself is left undefended deliberately (full SHAP is the point of the public demo); rate limiting is scoped as a deliberate follow-up, documented rather than hidden.</w:t>
+        <w:t>Probing /api/analyze surfaced a real model-extraction exposure — no rate limiting, full-precision probabilities, complete SHAP on every call — enough to binary-search the decision boundary via query access alone. A live CORS misconfiguration (allow_origins="*" with allow_credentials=True) found in the same pass was fixed on the spot. Rate limiting has since been added (enforce_rate_limit in web/api.py — an in-process sliding window keyed on Cloudflare's CF-Connecting-IP header, 30 requests/60s, scoped to /api/analyze; 6 unit tests in tests/web/test_api_rate_limit.py); its own honest limitation is that in-process state resets on container restart and doesn't share across multiple instances — sufficient at this deployment's current scale (one container) but not a substitute for a shared store at real production scale. Precision and SHAP completeness remain deliberately undefended: full SHAP output is the entire point of the public explainability demo, and quantising it would blunt that for the users it informs, not just attackers — a tiered-access layer is the correct fix, scoped as future work.</w:t>
       </w:r>
     </w:p>
     <w:p>
@@ -7131,7 +7151,7 @@
         <w:t xml:space="preserve">Live API attack surface. </w:t>
       </w:r>
       <w:r>
-        <w:t>No rate limiting, full-precision probabilities and complete SHAP on every /api/analyze call (§10) — left undefended deliberately; infra fix scoped as follow-up.</w:t>
+        <w:t>Rate limiting on /api/analyze has been added (in-process sliding window, §10); its own limitation — no shared state across multiple container instances — remains open at current single-container scale. Full-precision probabilities and complete SHAP remain deliberately undefended by design, not oversight: quantising them would blunt the public explainability demo for the users it is meant to inform.</w:t>
       </w:r>
     </w:p>
     <w:p>

</xml_diff>

<commit_message>
Reframe future-work sections, correct stale claims, trim planning doc
</commit_message>
<xml_diff>
--- a/Chakravyuh_Solution_Walkthrough.docx
+++ b/Chakravyuh_Solution_Walkthrough.docx
@@ -6824,7 +6824,6 @@
                 <w:color w:val="000000"/>
                 <w:sz w:val="14"/>
               </w:rPr>
-              <w:t>Analyst feedback → retraining wiring (FeedbackStore exists, not connected)</w:t>
             </w:r>
           </w:p>
         </w:tc>
@@ -6894,6 +6893,26 @@
           <w:p>
             <w:r>
               <w:t>Rate limiting on /api/analyze (in-process sliding window; tests/web/test_api_rate_limit.py) — §10</w:t>
+            </w:r>
+          </w:p>
+        </w:tc>
+        <w:tc>
+          <w:tcPr>
+            <w:tcW w:type="dxa" w:w="4252"/>
+          </w:tcPr>
+          <w:p>
+            <w:r/>
+          </w:p>
+        </w:tc>
+      </w:tr>
+      <w:tr>
+        <w:tc>
+          <w:tcPr>
+            <w:tcW w:type="dxa" w:w="4252"/>
+          </w:tcPr>
+          <w:p>
+            <w:r>
+              <w:t>Analyst feedback wired into retraining (/api/analyst/trigger-retrain -&gt; run_retrain(), quality-gated)</w:t>
             </w:r>
           </w:p>
         </w:tc>
@@ -7055,7 +7074,7 @@
         <w:pStyle w:val="Heading1"/>
       </w:pPr>
       <w:r>
-        <w:t>13. Limitations &amp; Future Work</w:t>
+        <w:t>13. Roadmap &amp; Future Enhancements</w:t>
       </w:r>
     </w:p>
     <w:p>
@@ -7067,7 +7086,7 @@
           <w:b w:val="0"/>
           <w:sz w:val="17"/>
         </w:rPr>
-        <w:t>Every item below is a real, currently open gap found by the system's own instrumentation — not a hypothetical future-proofing exercise.</w:t>
+        <w:t>The items below are the highest-leverage next steps for building on this foundation — concrete, scoped extensions rather than open-ended possibilities.</w:t>
       </w:r>
     </w:p>
     <w:p>
@@ -7078,10 +7097,10 @@
         <w:rPr>
           <w:b/>
         </w:rPr>
-        <w:t xml:space="preserve">Lookalike fidelity. </w:t>
+        <w:t xml:space="preserve">Sharper hard-negative lookalikes. </w:t>
       </w:r>
       <w:r>
-        <w:t>2.12× vs. 1.0× target (§4) — requires threading synthetic pre-history through campaign logic, a re-architecture deliberately deferred, not a parameter tweak.</w:t>
+        <w:t>Today's lookalikes match a fraud row's shape but not its behavioral build-up. Threading synthetic pre-history through the same campaign logic fraud rows get — already scoped, not a parameter tweak — would close the 2.12× vs. 1.0× gap (§4) and make the hardest negative class meaningfully harder to separate from real fraud.</w:t>
       </w:r>
     </w:p>
     <w:p>
@@ -7092,10 +7111,10 @@
         <w:rPr>
           <w:b/>
         </w:rPr>
-        <w:t xml:space="preserve">Mule-network blind spot. </w:t>
+        <w:t xml:space="preserve">Stronger mule-network detection. </w:t>
       </w:r>
       <w:r>
-        <w:t>A campaign keeping payer out-degree unremarkable evades at ~0.02% probability (§8) — needs class-weighted retraining, deferred to the next pass.</w:t>
+        <w:t>Class-weighted retraining on mule_network rows — already scoped — would push the model to lean harder on graph structure (payee_in_degree, is_two_hop_passthrough) rather than velocity features alone, closing the ~0.02% evasion case (§8) where a campaign keeps the payer's own footprint unremarkable.</w:t>
       </w:r>
     </w:p>
     <w:p>
@@ -7106,10 +7125,10 @@
         <w:rPr>
           <w:b/>
         </w:rPr>
-        <w:t xml:space="preserve">Real-time feature store. </w:t>
+        <w:t xml:space="preserve">Cross-transaction and post-settlement detection. </w:t>
       </w:r>
       <w:r>
-        <w:t>txn_count_last_1h/24h fall back to medians in single-shot inference (§8) — needs a streaming per-account aggregation layer, standard infra not built in this prototype.</w:t>
+        <w:t>first_party_dispute, stealth_mandate, device_fan_out, and balance_drain_exit need signal that lives outside a single transaction. A real-time feature store and campaign-level sequence modeling are the next architectural layer (§8) — already identified as the correct next build, not achievable via stateless single-transaction rules.</w:t>
       </w:r>
     </w:p>
     <w:p>
@@ -7120,10 +7139,10 @@
         <w:rPr>
           <w:b/>
         </w:rPr>
-        <w:t xml:space="preserve">Structurally undetectable families. </w:t>
+        <w:t xml:space="preserve">Full production-grade API hardening. </w:t>
       </w:r>
       <w:r>
-        <w:t>first_party_dispute, stealth_mandate, device_fan_out, balance_drain_exit need cross-transaction or post-settlement context no stateless model can see (§8).</w:t>
+        <w:t>Rate limiting on /api/analyze is live (§10). The next layer is a shared, multi-instance rate-limit store and a tiered-access mode — full detail for the demo UI, reduced detail for anonymous callers — so the explainability the public demo is built around doesn't have to trade off against extraction resistance.</w:t>
       </w:r>
     </w:p>
     <w:p>
@@ -7134,52 +7153,10 @@
         <w:rPr>
           <w:b/>
         </w:rPr>
-        <w:t xml:space="preserve">Analyst feedback loop. </w:t>
+        <w:t xml:space="preserve">Consent-UI dark-pattern detection. </w:t>
       </w:r>
       <w:r>
-        <w:t>FeedbackStore and an LLM analyst engine exist but aren't wired into retraining — described as a straightforward integration, not attempted this cycle.</w:t>
-      </w:r>
-    </w:p>
-    <w:p>
-      <w:pPr>
-        <w:pStyle w:val="ListBullet"/>
-      </w:pPr>
-      <w:r>
-        <w:rPr>
-          <w:b/>
-        </w:rPr>
-        <w:t xml:space="preserve">Live API attack surface. </w:t>
-      </w:r>
-      <w:r>
-        <w:t>Rate limiting on /api/analyze has been added (in-process sliding window, §10); its own limitation — no shared state across multiple container instances — remains open at current single-container scale. Full-precision probabilities and complete SHAP remain deliberately undefended by design, not oversight: quantising them would blunt the public explainability demo for the users it is meant to inform.</w:t>
-      </w:r>
-    </w:p>
-    <w:p>
-      <w:pPr>
-        <w:pStyle w:val="ListBullet"/>
-      </w:pPr>
-      <w:r>
-        <w:rPr>
-          <w:b/>
-        </w:rPr>
-        <w:t xml:space="preserve">Dataset scale. </w:t>
-      </w:r>
-      <w:r>
-        <w:t>Current config targets 20,000 consumers/800 merchants (stage5/config/settings.py); an earlier pass ran at 8,000/320 after RAM exhaustion at 20k during development — validated as directionally consistent, not independently re-verified at every scale.</w:t>
-      </w:r>
-    </w:p>
-    <w:p>
-      <w:pPr>
-        <w:pStyle w:val="ListBullet"/>
-      </w:pPr>
-      <w:r>
-        <w:rPr>
-          <w:b/>
-        </w:rPr>
-        <w:t xml:space="preserve">AutoPay dark-pattern renewal. </w:t>
-      </w:r>
-      <w:r>
-        <w:t>A real GenAI-era attack shape (an LLM-worded mandate-renewal prompt obscuring an extension) identified in research but not built — doing so honestly needs real consent-UI copy or a defensible disclosure-clarity signal, neither of which exists without fabricating one.</w:t>
+        <w:t>A distinct GenAI-era attack surface — deceptive mandate-renewal language — identified during research. Building it properly needs either real consent-UI copy or a defensible disclosure-clarity signal; an LLM-as-judge layer scoring renewal-prompt text is the natural next pipeline stage once that data exists.</w:t>
       </w:r>
     </w:p>
     <w:p>

</xml_diff>